<commit_message>
feat(rfp): v5 origin-agnostic — network-level packet/docx, monthly network table
</commit_message>
<xml_diff>
--- a/public/rfp/dl-k9x2w7q4/EarthBreeze_US_Parcel_RFP_2026.docx
+++ b/public/rfp/dl-k9x2w7q4/EarthBreeze_US_Parcel_RFP_2026.docx
@@ -223,7 +223,7 @@
           <w:sz w:val="21"/>
           <w:szCs w:val="21"/>
         </w:rPr>
-        <w:t xml:space="preserve">Destination profile: ~100% residential; each origin ships nationally (KY: 883 ZIP3s observed; OR: 962 ZIP3s — see data packet Geography and ZIP3 Detail tabs). Earth Breeze routes orders between origins and retains routing flexibility.</w:t>
+        <w:t xml:space="preserve">Destination profile: ~100% residential, national — all 50 states plus territories, 962 destination ZIP3s observed (see data packet Geography and ZIP3 Detail tabs). Demand data is presented network-level; historical fulfillment-origin attribution reflected internal routing choices and is not a routing commitment.</w:t>
       </w:r>
     </w:p>
     <w:p>
@@ -474,7 +474,7 @@
                 <w:sz w:val="19"/>
                 <w:szCs w:val="19"/>
               </w:rPr>
-              <w:t xml:space="preserve">1,526,716 parcels (KY 703,710 · OR 823,006)</w:t>
+              <w:t xml:space="preserve">1,526,716 parcels</w:t>
             </w:r>
           </w:p>
         </w:tc>
@@ -598,7 +598,7 @@
                 <w:sz w:val="19"/>
                 <w:szCs w:val="19"/>
               </w:rPr>
-              <w:t xml:space="preserve">Origin split (last 91 days)</w:t>
+              <w:t xml:space="preserve">Peak network day observed</w:t>
             </w:r>
           </w:p>
         </w:tc>
@@ -622,7 +622,7 @@
                 <w:sz w:val="19"/>
                 <w:szCs w:val="19"/>
               </w:rPr>
-              <w:t xml:space="preserve">Kentucky 56% · Oregon 44%</w:t>
+              <w:t xml:space="preserve">16,440 parcels (7 May 2026)</w:t>
             </w:r>
           </w:p>
         </w:tc>
@@ -672,7 +672,7 @@
                 <w:sz w:val="19"/>
                 <w:szCs w:val="19"/>
               </w:rPr>
-              <w:t xml:space="preserve">Peak network day observed</w:t>
+              <w:t xml:space="preserve">Average / median weight (network, last 91d)</w:t>
             </w:r>
           </w:p>
         </w:tc>
@@ -696,7 +696,7 @@
                 <w:sz w:val="19"/>
                 <w:szCs w:val="19"/>
               </w:rPr>
-              <w:t xml:space="preserve">16,440 parcels (7 May 2026)</w:t>
+              <w:t xml:space="preserve">0.99 lb / 0.62 lb</w:t>
             </w:r>
           </w:p>
         </w:tc>
@@ -720,7 +720,7 @@
                 <w:sz w:val="19"/>
                 <w:szCs w:val="19"/>
               </w:rPr>
-              <w:t xml:space="preserve">Overview tab</w:t>
+              <w:t xml:space="preserve">Weight Profile tab</w:t>
             </w:r>
           </w:p>
         </w:tc>
@@ -746,7 +746,7 @@
                 <w:sz w:val="19"/>
                 <w:szCs w:val="19"/>
               </w:rPr>
-              <w:t xml:space="preserve">Average / median weight (network, last 91d)</w:t>
+              <w:t xml:space="preserve">Parcels under 1 lb</w:t>
             </w:r>
           </w:p>
         </w:tc>
@@ -770,7 +770,7 @@
                 <w:sz w:val="19"/>
                 <w:szCs w:val="19"/>
               </w:rPr>
-              <w:t xml:space="preserve">0.99 lb / 0.62 lb</w:t>
+              <w:t xml:space="preserve">64.4% of volume (last 91d)</w:t>
             </w:r>
           </w:p>
         </w:tc>
@@ -820,7 +820,7 @@
                 <w:sz w:val="19"/>
                 <w:szCs w:val="19"/>
               </w:rPr>
-              <w:t xml:space="preserve">Parcels under 1 lb</w:t>
+              <w:t xml:space="preserve">Parcels 1–3 lb</w:t>
             </w:r>
           </w:p>
         </w:tc>
@@ -844,7 +844,7 @@
                 <w:sz w:val="19"/>
                 <w:szCs w:val="19"/>
               </w:rPr>
-              <w:t xml:space="preserve">64.4% of volume (last 91d)</w:t>
+              <w:t xml:space="preserve">26.8% of volume (last 91d)</w:t>
             </w:r>
           </w:p>
         </w:tc>
@@ -894,7 +894,7 @@
                 <w:sz w:val="19"/>
                 <w:szCs w:val="19"/>
               </w:rPr>
-              <w:t xml:space="preserve">Parcels 1–3 lb</w:t>
+              <w:t xml:space="preserve">Destination coverage</w:t>
             </w:r>
           </w:p>
         </w:tc>
@@ -918,81 +918,7 @@
                 <w:sz w:val="19"/>
                 <w:szCs w:val="19"/>
               </w:rPr>
-              <w:t xml:space="preserve">26.8% of volume (last 91d)</w:t>
-            </w:r>
-          </w:p>
-        </w:tc>
-        <w:tc>
-          <w:tcPr>
-            <w:tcW w:type="dxa" w:w="3600"/>
-            <w:tcMar>
-              <w:top w:type="dxa" w:w="60"/>
-              <w:left w:type="dxa" w:w="100"/>
-              <w:bottom w:type="dxa" w:w="60"/>
-              <w:right w:type="dxa" w:w="100"/>
-            </w:tcMar>
-          </w:tcPr>
-          <w:p>
-            <w:r>
-              <w:rPr>
-                <w:rFonts w:ascii="Arial" w:cs="Arial" w:eastAsia="Arial" w:hAnsi="Arial"/>
-                <w:b w:val="false"/>
-                <w:bCs w:val="false"/>
-                <w:color w:val="000000"/>
-                <w:sz w:val="19"/>
-                <w:szCs w:val="19"/>
-              </w:rPr>
-              <w:t xml:space="preserve">Weight Profile tab</w:t>
-            </w:r>
-          </w:p>
-        </w:tc>
-      </w:tr>
-      <w:tr>
-        <w:tc>
-          <w:tcPr>
-            <w:tcW w:type="dxa" w:w="3400"/>
-            <w:tcMar>
-              <w:top w:type="dxa" w:w="60"/>
-              <w:left w:type="dxa" w:w="100"/>
-              <w:bottom w:type="dxa" w:w="60"/>
-              <w:right w:type="dxa" w:w="100"/>
-            </w:tcMar>
-          </w:tcPr>
-          <w:p>
-            <w:r>
-              <w:rPr>
-                <w:rFonts w:ascii="Arial" w:cs="Arial" w:eastAsia="Arial" w:hAnsi="Arial"/>
-                <w:b w:val="false"/>
-                <w:bCs w:val="false"/>
-                <w:color w:val="000000"/>
-                <w:sz w:val="19"/>
-                <w:szCs w:val="19"/>
-              </w:rPr>
-              <w:t xml:space="preserve">Destination coverage</w:t>
-            </w:r>
-          </w:p>
-        </w:tc>
-        <w:tc>
-          <w:tcPr>
-            <w:tcW w:type="dxa" w:w="2600"/>
-            <w:tcMar>
-              <w:top w:type="dxa" w:w="60"/>
-              <w:left w:type="dxa" w:w="100"/>
-              <w:bottom w:type="dxa" w:w="60"/>
-              <w:right w:type="dxa" w:w="100"/>
-            </w:tcMar>
-          </w:tcPr>
-          <w:p>
-            <w:r>
-              <w:rPr>
-                <w:rFonts w:ascii="Arial" w:cs="Arial" w:eastAsia="Arial" w:hAnsi="Arial"/>
-                <w:b w:val="false"/>
-                <w:bCs w:val="false"/>
-                <w:color w:val="000000"/>
-                <w:sz w:val="19"/>
-                <w:szCs w:val="19"/>
-              </w:rPr>
-              <w:t xml:space="preserve">National from both origins (KY 883 / OR 962 ZIP3s)</w:t>
+              <w:t xml:space="preserve">All 50 states + territories · 962 ZIP3s observed</w:t>
             </w:r>
           </w:p>
         </w:tc>
@@ -1199,7 +1125,7 @@
           <w:sz w:val="21"/>
           <w:szCs w:val="21"/>
         </w:rPr>
-        <w:t xml:space="preserve">Network volume is stable at 200–240k/month with origin shares shifting via internal routing (Oregon led Jan–Apr; Kentucky since May). Proposals may cover one or both origins and must state per-origin capacity; Earth Breeze retains routing flexibility between origins.</w:t>
+        <w:t xml:space="preserve">Network volume is stable at 200–240k/month. Proposals may cover one or both quote origins and must state per-origin capacity. Earth Breeze routes orders dynamically, may adjust the origin footprint over the contract term, and prices should stand independently per origin.</w:t>
       </w:r>
     </w:p>
     <w:p>
@@ -1269,7 +1195,7 @@
           <w:sz w:val="21"/>
           <w:szCs w:val="21"/>
         </w:rPr>
-        <w:t xml:space="preserve">A lightweight solution for the sub-1 lb refill envelope (64% of network volume, concentrated at 0.25–0.5 lb; the Oregon origin ships a median 0.36 lb parcel). Carriers with a mail-class, presort, or lightweight parcel product should quote it explicitly alongside standard ounce tiers.</w:t>
+        <w:t xml:space="preserve">A lightweight solution for the sub-1 lb refill envelope (64% of network volume, concentrated at 0.25–0.5 lb). Carriers with a mail-class, presort, or lightweight parcel product should quote it explicitly alongside standard ounce tiers.</w:t>
       </w:r>
     </w:p>
     <w:p>
@@ -1287,7 +1213,7 @@
           <w:sz w:val="21"/>
           <w:szCs w:val="21"/>
         </w:rPr>
-        <w:t xml:space="preserve">Sharp 1–3 lb pricing: 27% of network volume falls between 1 and 3 lb (concentrated at the Kentucky origin) and the mix is trending heavier as multi-product orders grow.</w:t>
+        <w:t xml:space="preserve">Sharp 1–3 lb pricing: 27% of network volume falls between 1 and 3 lb and the mix is trending heavier as multi-product orders grow.</w:t>
       </w:r>
     </w:p>
     <w:p>
@@ -2615,7 +2541,7 @@
           <w:sz w:val="21"/>
           <w:szCs w:val="21"/>
         </w:rPr>
-        <w:t xml:space="preserve">Kentucky origin; shares are last-91-days and transit measured scan-to-scan on 36,573 delivered parcels, 9–22 July 2026 (Oregon transit data available on request). Kentucky migrated from presort mail (90% of January volume) to ground carriers through Q2 — network volume is fully portable to whichever carrier wins. Proposals should state expected transit by zone from each origin bid against this baseline.</w:t>
+        <w:t xml:space="preserve">Shares are last-91-days of the labeled subset; transit measured scan-to-scan on 36,573 delivered parcels, 9–22 July 2026, from the network’s eastern origin — treat as the baseline to meet or beat from each quote origin. The network migrated from presort mail (90% of January labeled volume) to ground carriers through Q2 — volume is fully portable to whichever carrier wins. Proposals should state expected transit by zone from each origin bid against this baseline.</w:t>
       </w:r>
     </w:p>
     <w:p>

</xml_diff>

<commit_message>
feat(rfp): data packet v5 + RFP docx — origin-agnostic network-level geography, ZIP3 density, network carrier matrix; both-origin quote framing
</commit_message>
<xml_diff>
--- a/public/rfp/dl-k9x2w7q4/EarthBreeze_US_Parcel_RFP_2026.docx
+++ b/public/rfp/dl-k9x2w7q4/EarthBreeze_US_Parcel_RFP_2026.docx
@@ -62,7 +62,7 @@
           <w:sz w:val="22"/>
           <w:szCs w:val="22"/>
         </w:rPr>
-        <w:t xml:space="preserve">Origins: Harrodsburg, KY 40330  +  White City, OR 97503</w:t>
+        <w:t xml:space="preserve">Quote origins: Harrodsburg, KY 40330  ·  White City, OR 97503</w:t>
       </w:r>
     </w:p>
     <w:p>
@@ -126,7 +126,7 @@
           <w:sz w:val="21"/>
           <w:szCs w:val="21"/>
         </w:rPr>
-        <w:t xml:space="preserve">Earth Breeze, Inc. ("Earth Breeze") is a rapidly growing direct-to-consumer eco-friendly laundry care brand. We invite qualified parcel carriers to submit proposals for US domestic residential parcel transportation across our entire two-origin fulfillment network: Harrodsburg, Kentucky 40330 (East) and White City, Oregon 97503 (West). Carriers may bid one or both origins.</w:t>
+        <w:t xml:space="preserve">Earth Breeze, Inc. ("Earth Breeze") is a rapidly growing direct-to-consumer eco-friendly laundry care brand. We invite qualified parcel carriers to submit proposals for US domestic residential parcel transportation across our entire DTC network. Carriers should quote from two origins — Harrodsburg, Kentucky 40330 and White City, Oregon 97503 — and may bid one or both. Earth Breeze may adjust or consolidate the origin footprint during the contract term; rates must not be contingent on a specific origin split.</w:t>
       </w:r>
     </w:p>
     <w:p>
@@ -139,7 +139,7 @@
           <w:sz w:val="21"/>
           <w:szCs w:val="21"/>
         </w:rPr>
-        <w:t xml:space="preserve">Earth Breeze currently ships approximately 2.9 million parcels per year across the network — stable at 200–240k parcels/month — with each origin shipping to all 50 states and a distinctive lightweight profile: 64% of parcels weigh under one pound and 84% under two pounds. We are seeking a carrier partner (or complementary multi-carrier mix) that can deliver reliable 2–5 day residential service at highly competitive lightweight rates, with room to scale as our volumes grow.</w:t>
+        <w:t xml:space="preserve">Earth Breeze currently ships approximately 2.9 million parcels per year — stable at 200–240k parcels/month — to all 50 states, with a distinctive lightweight profile: 64% of parcels weigh under one pound and 84% under two pounds. We are seeking a carrier partner (or complementary multi-carrier mix) that can deliver reliable 2–5 day residential service at highly competitive lightweight rates, with room to scale as our volumes grow.</w:t>
       </w:r>
     </w:p>
     <w:p>
@@ -205,7 +205,7 @@
           <w:sz w:val="21"/>
           <w:szCs w:val="21"/>
         </w:rPr>
-        <w:t xml:space="preserve">Shipping origins for this RFP: Harrodsburg, KY 40330 (East origin; single facility, dock-high) and White City, OR 97503 (West origin, Earth Breeze-operated). Daily pickup required at each.</w:t>
+        <w:t xml:space="preserve">Quote origins for this RFP: Harrodsburg, KY 40330 and White City, OR 97503. Provide a separate rate card per origin and daily pickup at each origin served. Earth Breeze routes orders dynamically and may adjust the origin footprint over the contract term — rate cards should not assume a fixed volume split.</w:t>
       </w:r>
     </w:p>
     <w:p>
@@ -1403,7 +1403,7 @@
           <w:sz w:val="21"/>
           <w:szCs w:val="21"/>
         </w:rPr>
-        <w:t xml:space="preserve">Separate rate cards per origin bid (zones from 40330 and/or 97503) by weight, including ounce tiers at minimum 4 oz / 8 oz / 12 oz / 15.999 oz, then per-pound to 20 lb.</w:t>
+        <w:t xml:space="preserve">Separate rate cards per quote origin (zones from 40330 and/or 97503) by weight, including ounce tiers at minimum 4 oz / 8 oz / 12 oz / 15.999 oz, then per-pound to 20 lb. State any pricing impact if the network consolidates to a single origin.</w:t>
       </w:r>
     </w:p>
     <w:p>

</xml_diff>